<commit_message>
add docx template and report for medical admin
</commit_message>
<xml_diff>
--- a/patients/templates/patients/docs/contract_IP_template.docx
+++ b/patients/templates/patients/docs/contract_IP_template.docx
@@ -111,22 +111,23 @@
     </w:p>
     <w:tbl>
       <w:tblPr>
-        <w:tblW w:w="9746" w:type="dxa"/>
+        <w:tblW w:w="11092" w:type="dxa"/>
+        <w:tblInd w:w="-1334" w:type="dxa"/>
         <w:tblLayout w:type="fixed"/>
         <w:tblLook w:val="01E0" w:firstRow="1" w:lastRow="1" w:firstColumn="1" w:lastColumn="1" w:noHBand="0" w:noVBand="0"/>
       </w:tblPr>
       <w:tblGrid>
-        <w:gridCol w:w="3156"/>
-        <w:gridCol w:w="3295"/>
-        <w:gridCol w:w="3295"/>
+        <w:gridCol w:w="3592"/>
+        <w:gridCol w:w="3750"/>
+        <w:gridCol w:w="3750"/>
       </w:tblGrid>
       <w:tr>
         <w:trPr>
-          <w:trHeight w:val="283"/>
+          <w:trHeight w:val="277"/>
         </w:trPr>
         <w:tc>
           <w:tcPr>
-            <w:tcW w:w="3156" w:type="dxa"/>
+            <w:tcW w:w="3592" w:type="dxa"/>
             <w:hideMark/>
           </w:tcPr>
           <w:p>
@@ -148,7 +149,7 @@
         </w:tc>
         <w:tc>
           <w:tcPr>
-            <w:tcW w:w="3295" w:type="dxa"/>
+            <w:tcW w:w="3750" w:type="dxa"/>
             <w:hideMark/>
           </w:tcPr>
           <w:p>
@@ -166,7 +167,7 @@
         </w:tc>
         <w:tc>
           <w:tcPr>
-            <w:tcW w:w="3295" w:type="dxa"/>
+            <w:tcW w:w="3750" w:type="dxa"/>
           </w:tcPr>
           <w:p>
             <w:pPr>
@@ -455,13 +456,13 @@
     <w:tbl>
       <w:tblPr>
         <w:tblStyle w:val="a8"/>
-        <w:tblW w:w="9503" w:type="dxa"/>
-        <w:tblInd w:w="-147" w:type="dxa"/>
+        <w:tblW w:w="11057" w:type="dxa"/>
+        <w:tblInd w:w="-1418" w:type="dxa"/>
         <w:tblLook w:val="04A0" w:firstRow="1" w:lastRow="0" w:firstColumn="1" w:lastColumn="0" w:noHBand="0" w:noVBand="1"/>
       </w:tblPr>
       <w:tblGrid>
-        <w:gridCol w:w="1886"/>
-        <w:gridCol w:w="7617"/>
+        <w:gridCol w:w="1985"/>
+        <w:gridCol w:w="9072"/>
       </w:tblGrid>
       <w:tr>
         <w:trPr>
@@ -469,7 +470,7 @@
         </w:trPr>
         <w:tc>
           <w:tcPr>
-            <w:tcW w:w="1886" w:type="dxa"/>
+            <w:tcW w:w="1985" w:type="dxa"/>
             <w:tcBorders>
               <w:top w:val="nil"/>
               <w:left w:val="nil"/>
@@ -515,7 +516,7 @@
         </w:tc>
         <w:tc>
           <w:tcPr>
-            <w:tcW w:w="7617" w:type="dxa"/>
+            <w:tcW w:w="9072" w:type="dxa"/>
             <w:tcBorders>
               <w:top w:val="nil"/>
               <w:left w:val="nil"/>
@@ -3726,19 +3727,8 @@
                 <w:sz w:val="13"/>
                 <w:szCs w:val="13"/>
               </w:rPr>
-              <w:t xml:space="preserve"> </w:t>
-            </w:r>
-            <w:proofErr w:type="gramStart"/>
-            <w:r>
-              <w:rPr>
-                <w:rFonts w:ascii="Times New Roman" w:hAnsi="Times New Roman" w:cs="Times New Roman"/>
-                <w:bCs/>
-                <w:sz w:val="13"/>
-                <w:szCs w:val="13"/>
-              </w:rPr>
-              <w:t>О.Е.</w:t>
-            </w:r>
-            <w:proofErr w:type="gramEnd"/>
+              <w:t xml:space="preserve"> О.Е.</w:t>
+            </w:r>
           </w:p>
         </w:tc>
         <w:tc>
@@ -4658,10 +4648,10 @@
         <w:noProof/>
       </w:rPr>
       <w:drawing>
-        <wp:anchor distT="0" distB="0" distL="114300" distR="114300" simplePos="0" relativeHeight="251658240" behindDoc="1" locked="0" layoutInCell="1" allowOverlap="1" wp14:anchorId="663486F3" wp14:editId="082A1410">
+        <wp:anchor distT="0" distB="0" distL="114300" distR="114300" simplePos="0" relativeHeight="251658240" behindDoc="1" locked="0" layoutInCell="1" allowOverlap="1" wp14:anchorId="663486F3" wp14:editId="104C648D">
           <wp:simplePos x="0" y="0"/>
           <wp:positionH relativeFrom="margin">
-            <wp:posOffset>2661920</wp:posOffset>
+            <wp:posOffset>2981097</wp:posOffset>
           </wp:positionH>
           <wp:positionV relativeFrom="paragraph">
             <wp:posOffset>12700</wp:posOffset>

</xml_diff>